<commit_message>
Update Abacus-AI.md: Add changelog requirement to AI instructions
</commit_message>
<xml_diff>
--- a/05-Agents/Abacus-AI.docx
+++ b/05-Agents/Abacus-AI.docx
@@ -5190,6 +5190,58 @@
       </w:r>
       <w:r>
         <w:t xml:space="preserve">by pushing to GitHub and confirming user can pull successfully</w:t>
+      </w:r>
+    </w:p>
+    <w:p>
+      <w:pPr>
+        <w:numPr>
+          <w:ilvl w:val="0"/>
+          <w:numId w:val="1024"/>
+        </w:numPr>
+        <w:pStyle w:val="Compact"/>
+      </w:pPr>
+      <w:r>
+        <w:rPr>
+          <w:bCs/>
+          <w:b/>
+        </w:rPr>
+        <w:t xml:space="preserve">Create a changelog note after every edit</w:t>
+      </w:r>
+      <w:r>
+        <w:t xml:space="preserve"> </w:t>
+      </w:r>
+      <w:r>
+        <w:t xml:space="preserve">to the</w:t>
+      </w:r>
+      <w:r>
+        <w:t xml:space="preserve"> </w:t>
+      </w:r>
+      <w:r>
+        <w:rPr>
+          <w:rStyle w:val="VerbatimChar"/>
+        </w:rPr>
+        <w:t xml:space="preserve">05-Agents/</w:t>
+      </w:r>
+      <w:r>
+        <w:t xml:space="preserve"> </w:t>
+      </w:r>
+      <w:r>
+        <w:t xml:space="preserve">folder — format:</w:t>
+      </w:r>
+      <w:r>
+        <w:t xml:space="preserve"> </w:t>
+      </w:r>
+      <w:r>
+        <w:rPr>
+          <w:rStyle w:val="VerbatimChar"/>
+        </w:rPr>
+        <w:t xml:space="preserve">[AGENT-NAME]-v[X.X]-Changes.md</w:t>
+      </w:r>
+      <w:r>
+        <w:t xml:space="preserve"> </w:t>
+      </w:r>
+      <w:r>
+        <w:t xml:space="preserve">documenting what changed and why</w:t>
       </w:r>
     </w:p>
     <w:p>

</xml_diff>

<commit_message>
v1.2: Fix 5 template issues — remove PDFs from templates, add facilitator/company tag, clarify AI workflow, add end-of-session checklist
</commit_message>
<xml_diff>
--- a/05-Agents/Abacus-AI.docx
+++ b/05-Agents/Abacus-AI.docx
@@ -5008,6 +5008,82 @@
             </w:pPr>
             <w:r>
               <w:t xml:space="preserve">Initial creation — captured all requirements from vault build conversation</w:t>
+            </w:r>
+          </w:p>
+        </w:tc>
+      </w:tr>
+      <w:tr>
+        <w:tc>
+          <w:tcPr/>
+          <w:p>
+            <w:pPr>
+              <w:pStyle w:val="Compact"/>
+              <w:jc w:val="left"/>
+            </w:pPr>
+            <w:r>
+              <w:t xml:space="preserve">2026-09-11</w:t>
+            </w:r>
+          </w:p>
+        </w:tc>
+        <w:tc>
+          <w:tcPr/>
+          <w:p>
+            <w:pPr>
+              <w:pStyle w:val="Compact"/>
+              <w:jc w:val="left"/>
+            </w:pPr>
+            <w:r>
+              <w:t xml:space="preserve">1.1</w:t>
+            </w:r>
+          </w:p>
+        </w:tc>
+        <w:tc>
+          <w:tcPr/>
+          <w:p>
+            <w:pPr>
+              <w:pStyle w:val="Compact"/>
+              <w:jc w:val="left"/>
+            </w:pPr>
+            <w:r>
+              <w:t xml:space="preserve">Rewrote all three templates with Templater plugin syntax</w:t>
+            </w:r>
+          </w:p>
+        </w:tc>
+      </w:tr>
+      <w:tr>
+        <w:tc>
+          <w:tcPr/>
+          <w:p>
+            <w:pPr>
+              <w:pStyle w:val="Compact"/>
+              <w:jc w:val="left"/>
+            </w:pPr>
+            <w:r>
+              <w:t xml:space="preserve">2026-09-11</w:t>
+            </w:r>
+          </w:p>
+        </w:tc>
+        <w:tc>
+          <w:tcPr/>
+          <w:p>
+            <w:pPr>
+              <w:pStyle w:val="Compact"/>
+              <w:jc w:val="left"/>
+            </w:pPr>
+            <w:r>
+              <w:t xml:space="preserve">1.2</w:t>
+            </w:r>
+          </w:p>
+        </w:tc>
+        <w:tc>
+          <w:tcPr/>
+          <w:p>
+            <w:pPr>
+              <w:pStyle w:val="Compact"/>
+              <w:jc w:val="left"/>
+            </w:pPr>
+            <w:r>
+              <w:t xml:space="preserve">Fixed template issues: removed PDF/DOCX from 00-Templates, added facilitator prompt to Session-Note and Client-Summary-Email, added company tag (the-keystone-group) to all templates, clarified AI-Derived Action Steps workflow, added End-of-Session Checklist</w:t>
             </w:r>
           </w:p>
         </w:tc>

</xml_diff>

<commit_message>
v1.3: Add Documents/ subfolder to client folder structure
</commit_message>
<xml_diff>
--- a/05-Agents/Abacus-AI.docx
+++ b/05-Agents/Abacus-AI.docx
@@ -1211,7 +1211,16 @@
         <w:rPr>
           <w:rStyle w:val="VerbatimChar"/>
         </w:rPr>
-        <w:t xml:space="preserve">│       └── Sessions/          # All session notes</w:t>
+        <w:t xml:space="preserve">│       ├── Sessions/          # All session notes</w:t>
+      </w:r>
+      <w:r>
+        <w:br/>
+      </w:r>
+      <w:r>
+        <w:rPr>
+          <w:rStyle w:val="VerbatimChar"/>
+        </w:rPr>
+        <w:t xml:space="preserve">│       └── Documents/         # Client's uploaded files, forms, attachments</w:t>
       </w:r>
       <w:r>
         <w:br/>
@@ -1587,7 +1596,7 @@
         <w:pStyle w:val="Compact"/>
       </w:pPr>
       <w:r>
-        <w:t xml:space="preserve">Duplicate</w:t>
+        <w:t xml:space="preserve">Create folder:</w:t>
       </w:r>
       <w:r>
         <w:t xml:space="preserve"> </w:t>
@@ -1596,7 +1605,7 @@
         <w:rPr>
           <w:rStyle w:val="VerbatimChar"/>
         </w:rPr>
-        <w:t xml:space="preserve">00-Templates/OPFMS-Client-Master.md</w:t>
+        <w:t xml:space="preserve">01-Clients/[FirstName-LastName]/</w:t>
       </w:r>
     </w:p>
     <w:p>
@@ -1608,7 +1617,7 @@
         <w:pStyle w:val="Compact"/>
       </w:pPr>
       <w:r>
-        <w:t xml:space="preserve">Create folder:</w:t>
+        <w:t xml:space="preserve">Create subfolder:</w:t>
       </w:r>
       <w:r>
         <w:t xml:space="preserve"> </w:t>
@@ -1617,7 +1626,7 @@
         <w:rPr>
           <w:rStyle w:val="VerbatimChar"/>
         </w:rPr>
-        <w:t xml:space="preserve">01-Clients/[FirstName-LastName]/</w:t>
+        <w:t xml:space="preserve">01-Clients/[FirstName-LastName]/Sessions/</w:t>
       </w:r>
     </w:p>
     <w:p>
@@ -1638,7 +1647,7 @@
         <w:rPr>
           <w:rStyle w:val="VerbatimChar"/>
         </w:rPr>
-        <w:t xml:space="preserve">01-Clients/[FirstName-LastName]/Sessions/</w:t>
+        <w:t xml:space="preserve">01-Clients/[FirstName-LastName]/Documents/</w:t>
       </w:r>
     </w:p>
     <w:p>
@@ -1650,7 +1659,7 @@
         <w:pStyle w:val="Compact"/>
       </w:pPr>
       <w:r>
-        <w:t xml:space="preserve">Rename duplicated template:</w:t>
+        <w:t xml:space="preserve">Inside the client folder, create a new note using Templater → insert</w:t>
       </w:r>
       <w:r>
         <w:t xml:space="preserve"> </w:t>
@@ -1659,6 +1668,45 @@
         <w:rPr>
           <w:rStyle w:val="VerbatimChar"/>
         </w:rPr>
+        <w:t xml:space="preserve">OPFMS-Client-Master</w:t>
+      </w:r>
+      <w:r>
+        <w:t xml:space="preserve"> </w:t>
+      </w:r>
+      <w:r>
+        <w:t xml:space="preserve">template</w:t>
+      </w:r>
+    </w:p>
+    <w:p>
+      <w:pPr>
+        <w:numPr>
+          <w:ilvl w:val="0"/>
+          <w:numId w:val="1005"/>
+        </w:numPr>
+        <w:pStyle w:val="Compact"/>
+      </w:pPr>
+      <w:r>
+        <w:t xml:space="preserve">Answer all prompts (name, email, mobile, DOB, job, org, start date, facilitator)</w:t>
+      </w:r>
+    </w:p>
+    <w:p>
+      <w:pPr>
+        <w:numPr>
+          <w:ilvl w:val="0"/>
+          <w:numId w:val="1005"/>
+        </w:numPr>
+        <w:pStyle w:val="Compact"/>
+      </w:pPr>
+      <w:r>
+        <w:t xml:space="preserve">File auto-renames to</w:t>
+      </w:r>
+      <w:r>
+        <w:t xml:space="preserve"> </w:t>
+      </w:r>
+      <w:r>
+        <w:rPr>
+          <w:rStyle w:val="VerbatimChar"/>
+        </w:rPr>
         <w:t xml:space="preserve">OPFMS-[FirstName-LastName].md</w:t>
       </w:r>
     </w:p>
@@ -1671,7 +1719,7 @@
         <w:pStyle w:val="Compact"/>
       </w:pPr>
       <w:r>
-        <w:t xml:space="preserve">Fill in YAML frontmatter</w:t>
+        <w:t xml:space="preserve">Fill in Participant Profile section (auto-populated from prompts)</w:t>
       </w:r>
     </w:p>
     <w:p>
@@ -1683,7 +1731,7 @@
         <w:pStyle w:val="Compact"/>
       </w:pPr>
       <w:r>
-        <w:t xml:space="preserve">Fill in Participant Profile section</w:t>
+        <w:t xml:space="preserve">Run personality assessment → fill Personality Profile</w:t>
       </w:r>
     </w:p>
     <w:p>
@@ -1695,7 +1743,7 @@
         <w:pStyle w:val="Compact"/>
       </w:pPr>
       <w:r>
-        <w:t xml:space="preserve">Run personality assessment → fill Personality Profile</w:t>
+        <w:t xml:space="preserve">Define intangibles together with client (custom scale definitions for each)</w:t>
       </w:r>
     </w:p>
     <w:p>
@@ -1707,7 +1755,34 @@
         <w:pStyle w:val="Compact"/>
       </w:pPr>
       <w:r>
-        <w:t xml:space="preserve">Define intangibles together with client (custom scale definitions)</w:t>
+        <w:t xml:space="preserve">Fill in Important Facilitator Notes (</w:t>
+      </w:r>
+      <w:r>
+        <w:t xml:space="preserve">“</w:t>
+      </w:r>
+      <w:r>
+        <w:t xml:space="preserve">What NOT to do</w:t>
+      </w:r>
+      <w:r>
+        <w:t xml:space="preserve">”</w:t>
+      </w:r>
+      <w:r>
+        <w:t xml:space="preserve">,</w:t>
+      </w:r>
+      <w:r>
+        <w:t xml:space="preserve"> </w:t>
+      </w:r>
+      <w:r>
+        <w:t xml:space="preserve">“</w:t>
+      </w:r>
+      <w:r>
+        <w:t xml:space="preserve">How to care</w:t>
+      </w:r>
+      <w:r>
+        <w:t xml:space="preserve">”</w:t>
+      </w:r>
+      <w:r>
+        <w:t xml:space="preserve">, patterns)</w:t>
       </w:r>
     </w:p>
     <w:bookmarkEnd w:id="36"/>
@@ -5084,6 +5159,44 @@
             </w:pPr>
             <w:r>
               <w:t xml:space="preserve">Fixed template issues: removed PDF/DOCX from 00-Templates, added facilitator prompt to Session-Note and Client-Summary-Email, added company tag (the-keystone-group) to all templates, clarified AI-Derived Action Steps workflow, added End-of-Session Checklist</w:t>
+            </w:r>
+          </w:p>
+        </w:tc>
+      </w:tr>
+      <w:tr>
+        <w:tc>
+          <w:tcPr/>
+          <w:p>
+            <w:pPr>
+              <w:pStyle w:val="Compact"/>
+              <w:jc w:val="left"/>
+            </w:pPr>
+            <w:r>
+              <w:t xml:space="preserve">2026-09-11</w:t>
+            </w:r>
+          </w:p>
+        </w:tc>
+        <w:tc>
+          <w:tcPr/>
+          <w:p>
+            <w:pPr>
+              <w:pStyle w:val="Compact"/>
+              <w:jc w:val="left"/>
+            </w:pPr>
+            <w:r>
+              <w:t xml:space="preserve">1.3</w:t>
+            </w:r>
+          </w:p>
+        </w:tc>
+        <w:tc>
+          <w:tcPr/>
+          <w:p>
+            <w:pPr>
+              <w:pStyle w:val="Compact"/>
+              <w:jc w:val="left"/>
+            </w:pPr>
+            <w:r>
+              <w:t xml:space="preserve">Added Documents/ subfolder to client folder structure for storing uploaded files, forms, and attachments</w:t>
             </w:r>
           </w:p>
         </w:tc>

</xml_diff>

<commit_message>
v1.4: Add New-Client-Setup wizard — one trigger creates folders + OPFMS
</commit_message>
<xml_diff>
--- a/05-Agents/Abacus-AI.docx
+++ b/05-Agents/Abacus-AI.docx
@@ -1578,13 +1578,292 @@
         <w:t xml:space="preserve">Workflow Patterns</w:t>
       </w:r>
     </w:p>
-    <w:bookmarkStart w:id="36" w:name="creating-a-new-client"/>
+    <w:bookmarkStart w:id="36" w:name="creating-a-new-client-one-button-setup"/>
     <w:p>
       <w:pPr>
         <w:pStyle w:val="Heading3"/>
       </w:pPr>
       <w:r>
-        <w:t xml:space="preserve">Creating a New Client</w:t>
+        <w:t xml:space="preserve">Creating a New Client (One-Button Setup)</w:t>
+      </w:r>
+    </w:p>
+    <w:p>
+      <w:pPr>
+        <w:pStyle w:val="FirstParagraph"/>
+      </w:pPr>
+      <w:r>
+        <w:t xml:space="preserve">Use the</w:t>
+      </w:r>
+      <w:r>
+        <w:t xml:space="preserve"> </w:t>
+      </w:r>
+      <w:r>
+        <w:rPr>
+          <w:bCs/>
+          <w:b/>
+        </w:rPr>
+        <w:t xml:space="preserve">New Client Setup Wizard</w:t>
+      </w:r>
+      <w:r>
+        <w:t xml:space="preserve"> </w:t>
+      </w:r>
+      <w:r>
+        <w:t xml:space="preserve">— one trigger creates everything automatically.</w:t>
+      </w:r>
+    </w:p>
+    <w:p>
+      <w:pPr>
+        <w:pStyle w:val="BodyText"/>
+      </w:pPr>
+      <w:r>
+        <w:rPr>
+          <w:bCs/>
+          <w:b/>
+        </w:rPr>
+        <w:t xml:space="preserve">How to trigger:</w:t>
+      </w:r>
+      <w:r>
+        <w:t xml:space="preserve"> </w:t>
+      </w:r>
+      <w:r>
+        <w:t xml:space="preserve">-</w:t>
+      </w:r>
+      <w:r>
+        <w:t xml:space="preserve"> </w:t>
+      </w:r>
+      <w:r>
+        <w:rPr>
+          <w:rStyle w:val="VerbatimChar"/>
+        </w:rPr>
+        <w:t xml:space="preserve">Cmd+P</w:t>
+      </w:r>
+      <w:r>
+        <w:t xml:space="preserve"> </w:t>
+      </w:r>
+      <w:r>
+        <w:t xml:space="preserve">→</w:t>
+      </w:r>
+      <w:r>
+        <w:t xml:space="preserve"> </w:t>
+      </w:r>
+      <w:r>
+        <w:t xml:space="preserve">“</w:t>
+      </w:r>
+      <w:r>
+        <w:t xml:space="preserve">Templater: Create new note from template</w:t>
+      </w:r>
+      <w:r>
+        <w:t xml:space="preserve">”</w:t>
+      </w:r>
+      <w:r>
+        <w:t xml:space="preserve"> </w:t>
+      </w:r>
+      <w:r>
+        <w:t xml:space="preserve">→ select</w:t>
+      </w:r>
+      <w:r>
+        <w:t xml:space="preserve"> </w:t>
+      </w:r>
+      <w:r>
+        <w:rPr>
+          <w:rStyle w:val="VerbatimChar"/>
+          <w:bCs/>
+          <w:b/>
+        </w:rPr>
+        <w:t xml:space="preserve">New-Client-Setup</w:t>
+      </w:r>
+    </w:p>
+    <w:p>
+      <w:pPr>
+        <w:pStyle w:val="BodyText"/>
+      </w:pPr>
+      <w:r>
+        <w:rPr>
+          <w:bCs/>
+          <w:b/>
+        </w:rPr>
+        <w:t xml:space="preserve">What the wizard does automatically:</w:t>
+      </w:r>
+      <w:r>
+        <w:t xml:space="preserve"> </w:t>
+      </w:r>
+      <w:r>
+        <w:t xml:space="preserve">1. Prompts for client info (First Name, Last Name, Email, Mobile, DOB, Job Title, Organization, Start Date, Facilitator)</w:t>
+      </w:r>
+      <w:r>
+        <w:t xml:space="preserve"> </w:t>
+      </w:r>
+      <w:r>
+        <w:t xml:space="preserve">2. Creates</w:t>
+      </w:r>
+      <w:r>
+        <w:t xml:space="preserve"> </w:t>
+      </w:r>
+      <w:r>
+        <w:rPr>
+          <w:rStyle w:val="VerbatimChar"/>
+        </w:rPr>
+        <w:t xml:space="preserve">01-Clients/FirstName-LastName/</w:t>
+      </w:r>
+      <w:r>
+        <w:t xml:space="preserve"> </w:t>
+      </w:r>
+      <w:r>
+        <w:t xml:space="preserve">folder</w:t>
+      </w:r>
+      <w:r>
+        <w:t xml:space="preserve"> </w:t>
+      </w:r>
+      <w:r>
+        <w:t xml:space="preserve">3. Creates</w:t>
+      </w:r>
+      <w:r>
+        <w:t xml:space="preserve"> </w:t>
+      </w:r>
+      <w:r>
+        <w:rPr>
+          <w:rStyle w:val="VerbatimChar"/>
+        </w:rPr>
+        <w:t xml:space="preserve">Sessions/</w:t>
+      </w:r>
+      <w:r>
+        <w:t xml:space="preserve"> </w:t>
+      </w:r>
+      <w:r>
+        <w:t xml:space="preserve">subfolder</w:t>
+      </w:r>
+      <w:r>
+        <w:t xml:space="preserve"> </w:t>
+      </w:r>
+      <w:r>
+        <w:t xml:space="preserve">4. Creates</w:t>
+      </w:r>
+      <w:r>
+        <w:t xml:space="preserve"> </w:t>
+      </w:r>
+      <w:r>
+        <w:rPr>
+          <w:rStyle w:val="VerbatimChar"/>
+        </w:rPr>
+        <w:t xml:space="preserve">Documents/</w:t>
+      </w:r>
+      <w:r>
+        <w:t xml:space="preserve"> </w:t>
+      </w:r>
+      <w:r>
+        <w:t xml:space="preserve">subfolder</w:t>
+      </w:r>
+      <w:r>
+        <w:t xml:space="preserve"> </w:t>
+      </w:r>
+      <w:r>
+        <w:t xml:space="preserve">5. Generates the full OPFMS note with all fields pre-filled and opens it</w:t>
+      </w:r>
+      <w:r>
+        <w:t xml:space="preserve"> </w:t>
+      </w:r>
+      <w:r>
+        <w:t xml:space="preserve">6. Self-destructs the temporary setup note</w:t>
+      </w:r>
+    </w:p>
+    <w:p>
+      <w:pPr>
+        <w:pStyle w:val="BodyText"/>
+      </w:pPr>
+      <w:r>
+        <w:rPr>
+          <w:bCs/>
+          <w:b/>
+        </w:rPr>
+        <w:t xml:space="preserve">After setup — what still needs manual entry:</w:t>
+      </w:r>
+      <w:r>
+        <w:t xml:space="preserve"> </w:t>
+      </w:r>
+      <w:r>
+        <w:t xml:space="preserve">- Personality Profile (run the assessment first, then fill in)</w:t>
+      </w:r>
+      <w:r>
+        <w:t xml:space="preserve"> </w:t>
+      </w:r>
+      <w:r>
+        <w:t xml:space="preserve">- Win-Win Challenges (discuss with client in Session 1)</w:t>
+      </w:r>
+      <w:r>
+        <w:t xml:space="preserve"> </w:t>
+      </w:r>
+      <w:r>
+        <w:t xml:space="preserve">- Wheel of Life scores (baseline assessment)</w:t>
+      </w:r>
+      <w:r>
+        <w:t xml:space="preserve"> </w:t>
+      </w:r>
+      <w:r>
+        <w:t xml:space="preserve">- Intangibles #1–3 (define together with client — names + scale descriptions)</w:t>
+      </w:r>
+      <w:r>
+        <w:t xml:space="preserve"> </w:t>
+      </w:r>
+      <w:r>
+        <w:t xml:space="preserve">- Important Facilitator Notes (</w:t>
+      </w:r>
+      <w:r>
+        <w:t xml:space="preserve">“</w:t>
+      </w:r>
+      <w:r>
+        <w:t xml:space="preserve">What NOT to do</w:t>
+      </w:r>
+      <w:r>
+        <w:t xml:space="preserve">”</w:t>
+      </w:r>
+      <w:r>
+        <w:t xml:space="preserve">,</w:t>
+      </w:r>
+      <w:r>
+        <w:t xml:space="preserve"> </w:t>
+      </w:r>
+      <w:r>
+        <w:t xml:space="preserve">“</w:t>
+      </w:r>
+      <w:r>
+        <w:t xml:space="preserve">How to care</w:t>
+      </w:r>
+      <w:r>
+        <w:t xml:space="preserve">”</w:t>
+      </w:r>
+      <w:r>
+        <w:t xml:space="preserve">, patterns)</w:t>
+      </w:r>
+    </w:p>
+    <w:p>
+      <w:pPr>
+        <w:pStyle w:val="BodyText"/>
+      </w:pPr>
+      <w:r>
+        <w:rPr>
+          <w:bCs/>
+          <w:b/>
+        </w:rPr>
+        <w:t xml:space="preserve">Template file:</w:t>
+      </w:r>
+      <w:r>
+        <w:t xml:space="preserve"> </w:t>
+      </w:r>
+      <w:r>
+        <w:rPr>
+          <w:rStyle w:val="VerbatimChar"/>
+        </w:rPr>
+        <w:t xml:space="preserve">00-Templates/New-Client-Setup.md</w:t>
+      </w:r>
+    </w:p>
+    <w:bookmarkEnd w:id="36"/>
+    <w:bookmarkStart w:id="37" w:name="starting-a-new-session"/>
+    <w:p>
+      <w:pPr>
+        <w:pStyle w:val="Heading3"/>
+      </w:pPr>
+      <w:r>
+        <w:t xml:space="preserve">Starting a New Session</w:t>
       </w:r>
     </w:p>
     <w:p>
@@ -1596,7 +1875,7 @@
         <w:pStyle w:val="Compact"/>
       </w:pPr>
       <w:r>
-        <w:t xml:space="preserve">Create folder:</w:t>
+        <w:t xml:space="preserve">Open client’s</w:t>
       </w:r>
       <w:r>
         <w:t xml:space="preserve"> </w:t>
@@ -1605,7 +1884,13 @@
         <w:rPr>
           <w:rStyle w:val="VerbatimChar"/>
         </w:rPr>
-        <w:t xml:space="preserve">01-Clients/[FirstName-LastName]/</w:t>
+        <w:t xml:space="preserve">OPFMS-[Name].md</w:t>
+      </w:r>
+      <w:r>
+        <w:t xml:space="preserve"> </w:t>
+      </w:r>
+      <w:r>
+        <w:t xml:space="preserve">→ review Session Log for context</w:t>
       </w:r>
     </w:p>
     <w:p>
@@ -1617,7 +1902,7 @@
         <w:pStyle w:val="Compact"/>
       </w:pPr>
       <w:r>
-        <w:t xml:space="preserve">Create subfolder:</w:t>
+        <w:t xml:space="preserve">Duplicate</w:t>
       </w:r>
       <w:r>
         <w:t xml:space="preserve"> </w:t>
@@ -1626,7 +1911,7 @@
         <w:rPr>
           <w:rStyle w:val="VerbatimChar"/>
         </w:rPr>
-        <w:t xml:space="preserve">01-Clients/[FirstName-LastName]/Sessions/</w:t>
+        <w:t xml:space="preserve">00-Templates/Session-Note.md</w:t>
       </w:r>
     </w:p>
     <w:p>
@@ -1638,7 +1923,7 @@
         <w:pStyle w:val="Compact"/>
       </w:pPr>
       <w:r>
-        <w:t xml:space="preserve">Create subfolder:</w:t>
+        <w:t xml:space="preserve">Rename:</w:t>
       </w:r>
       <w:r>
         <w:t xml:space="preserve"> </w:t>
@@ -1647,7 +1932,7 @@
         <w:rPr>
           <w:rStyle w:val="VerbatimChar"/>
         </w:rPr>
-        <w:t xml:space="preserve">01-Clients/[FirstName-LastName]/Documents/</w:t>
+        <w:t xml:space="preserve">YYYY-MM-DD-Session-XX-LXX.md</w:t>
       </w:r>
     </w:p>
     <w:p>
@@ -1659,7 +1944,7 @@
         <w:pStyle w:val="Compact"/>
       </w:pPr>
       <w:r>
-        <w:t xml:space="preserve">Inside the client folder, create a new note using Templater → insert</w:t>
+        <w:t xml:space="preserve">Move into</w:t>
       </w:r>
       <w:r>
         <w:t xml:space="preserve"> </w:t>
@@ -1668,13 +1953,7 @@
         <w:rPr>
           <w:rStyle w:val="VerbatimChar"/>
         </w:rPr>
-        <w:t xml:space="preserve">OPFMS-Client-Master</w:t>
-      </w:r>
-      <w:r>
-        <w:t xml:space="preserve"> </w:t>
-      </w:r>
-      <w:r>
-        <w:t xml:space="preserve">template</w:t>
+        <w:t xml:space="preserve">01-Clients/[Name]/Sessions/</w:t>
       </w:r>
     </w:p>
     <w:p>
@@ -1686,7 +1965,23 @@
         <w:pStyle w:val="Compact"/>
       </w:pPr>
       <w:r>
-        <w:t xml:space="preserve">Answer all prompts (name, email, mobile, DOB, job, org, start date, facilitator)</w:t>
+        <w:t xml:space="preserve">Fill</w:t>
+      </w:r>
+      <w:r>
+        <w:t xml:space="preserve"> </w:t>
+      </w:r>
+      <w:r>
+        <w:rPr>
+          <w:bCs/>
+          <w:b/>
+        </w:rPr>
+        <w:t xml:space="preserve">Carry-Forward</w:t>
+      </w:r>
+      <w:r>
+        <w:t xml:space="preserve"> </w:t>
+      </w:r>
+      <w:r>
+        <w:t xml:space="preserve">section from previous session note</w:t>
       </w:r>
     </w:p>
     <w:p>
@@ -1698,16 +1993,7 @@
         <w:pStyle w:val="Compact"/>
       </w:pPr>
       <w:r>
-        <w:t xml:space="preserve">File auto-renames to</w:t>
-      </w:r>
-      <w:r>
-        <w:t xml:space="preserve"> </w:t>
-      </w:r>
-      <w:r>
-        <w:rPr>
-          <w:rStyle w:val="VerbatimChar"/>
-        </w:rPr>
-        <w:t xml:space="preserve">OPFMS-[FirstName-LastName].md</w:t>
+        <w:t xml:space="preserve">Update intangible scores at start or end of session</w:t>
       </w:r>
     </w:p>
     <w:p>
@@ -1719,7 +2005,7 @@
         <w:pStyle w:val="Compact"/>
       </w:pPr>
       <w:r>
-        <w:t xml:space="preserve">Fill in Participant Profile section (auto-populated from prompts)</w:t>
+        <w:t xml:space="preserve">Take notes during session</w:t>
       </w:r>
     </w:p>
     <w:p>
@@ -1731,7 +2017,7 @@
         <w:pStyle w:val="Compact"/>
       </w:pPr>
       <w:r>
-        <w:t xml:space="preserve">Run personality assessment → fill Personality Profile</w:t>
+        <w:t xml:space="preserve">At end: choose assignment from selector, draft client summary</w:t>
       </w:r>
     </w:p>
     <w:p>
@@ -1739,221 +2025,6 @@
         <w:numPr>
           <w:ilvl w:val="0"/>
           <w:numId w:val="1005"/>
-        </w:numPr>
-        <w:pStyle w:val="Compact"/>
-      </w:pPr>
-      <w:r>
-        <w:t xml:space="preserve">Define intangibles together with client (custom scale definitions for each)</w:t>
-      </w:r>
-    </w:p>
-    <w:p>
-      <w:pPr>
-        <w:numPr>
-          <w:ilvl w:val="0"/>
-          <w:numId w:val="1005"/>
-        </w:numPr>
-        <w:pStyle w:val="Compact"/>
-      </w:pPr>
-      <w:r>
-        <w:t xml:space="preserve">Fill in Important Facilitator Notes (</w:t>
-      </w:r>
-      <w:r>
-        <w:t xml:space="preserve">“</w:t>
-      </w:r>
-      <w:r>
-        <w:t xml:space="preserve">What NOT to do</w:t>
-      </w:r>
-      <w:r>
-        <w:t xml:space="preserve">”</w:t>
-      </w:r>
-      <w:r>
-        <w:t xml:space="preserve">,</w:t>
-      </w:r>
-      <w:r>
-        <w:t xml:space="preserve"> </w:t>
-      </w:r>
-      <w:r>
-        <w:t xml:space="preserve">“</w:t>
-      </w:r>
-      <w:r>
-        <w:t xml:space="preserve">How to care</w:t>
-      </w:r>
-      <w:r>
-        <w:t xml:space="preserve">”</w:t>
-      </w:r>
-      <w:r>
-        <w:t xml:space="preserve">, patterns)</w:t>
-      </w:r>
-    </w:p>
-    <w:bookmarkEnd w:id="36"/>
-    <w:bookmarkStart w:id="37" w:name="starting-a-new-session"/>
-    <w:p>
-      <w:pPr>
-        <w:pStyle w:val="Heading3"/>
-      </w:pPr>
-      <w:r>
-        <w:t xml:space="preserve">Starting a New Session</w:t>
-      </w:r>
-    </w:p>
-    <w:p>
-      <w:pPr>
-        <w:numPr>
-          <w:ilvl w:val="0"/>
-          <w:numId w:val="1006"/>
-        </w:numPr>
-        <w:pStyle w:val="Compact"/>
-      </w:pPr>
-      <w:r>
-        <w:t xml:space="preserve">Open client’s</w:t>
-      </w:r>
-      <w:r>
-        <w:t xml:space="preserve"> </w:t>
-      </w:r>
-      <w:r>
-        <w:rPr>
-          <w:rStyle w:val="VerbatimChar"/>
-        </w:rPr>
-        <w:t xml:space="preserve">OPFMS-[Name].md</w:t>
-      </w:r>
-      <w:r>
-        <w:t xml:space="preserve"> </w:t>
-      </w:r>
-      <w:r>
-        <w:t xml:space="preserve">→ review Session Log for context</w:t>
-      </w:r>
-    </w:p>
-    <w:p>
-      <w:pPr>
-        <w:numPr>
-          <w:ilvl w:val="0"/>
-          <w:numId w:val="1006"/>
-        </w:numPr>
-        <w:pStyle w:val="Compact"/>
-      </w:pPr>
-      <w:r>
-        <w:t xml:space="preserve">Duplicate</w:t>
-      </w:r>
-      <w:r>
-        <w:t xml:space="preserve"> </w:t>
-      </w:r>
-      <w:r>
-        <w:rPr>
-          <w:rStyle w:val="VerbatimChar"/>
-        </w:rPr>
-        <w:t xml:space="preserve">00-Templates/Session-Note.md</w:t>
-      </w:r>
-    </w:p>
-    <w:p>
-      <w:pPr>
-        <w:numPr>
-          <w:ilvl w:val="0"/>
-          <w:numId w:val="1006"/>
-        </w:numPr>
-        <w:pStyle w:val="Compact"/>
-      </w:pPr>
-      <w:r>
-        <w:t xml:space="preserve">Rename:</w:t>
-      </w:r>
-      <w:r>
-        <w:t xml:space="preserve"> </w:t>
-      </w:r>
-      <w:r>
-        <w:rPr>
-          <w:rStyle w:val="VerbatimChar"/>
-        </w:rPr>
-        <w:t xml:space="preserve">YYYY-MM-DD-Session-XX-LXX.md</w:t>
-      </w:r>
-    </w:p>
-    <w:p>
-      <w:pPr>
-        <w:numPr>
-          <w:ilvl w:val="0"/>
-          <w:numId w:val="1006"/>
-        </w:numPr>
-        <w:pStyle w:val="Compact"/>
-      </w:pPr>
-      <w:r>
-        <w:t xml:space="preserve">Move into</w:t>
-      </w:r>
-      <w:r>
-        <w:t xml:space="preserve"> </w:t>
-      </w:r>
-      <w:r>
-        <w:rPr>
-          <w:rStyle w:val="VerbatimChar"/>
-        </w:rPr>
-        <w:t xml:space="preserve">01-Clients/[Name]/Sessions/</w:t>
-      </w:r>
-    </w:p>
-    <w:p>
-      <w:pPr>
-        <w:numPr>
-          <w:ilvl w:val="0"/>
-          <w:numId w:val="1006"/>
-        </w:numPr>
-        <w:pStyle w:val="Compact"/>
-      </w:pPr>
-      <w:r>
-        <w:t xml:space="preserve">Fill</w:t>
-      </w:r>
-      <w:r>
-        <w:t xml:space="preserve"> </w:t>
-      </w:r>
-      <w:r>
-        <w:rPr>
-          <w:bCs/>
-          <w:b/>
-        </w:rPr>
-        <w:t xml:space="preserve">Carry-Forward</w:t>
-      </w:r>
-      <w:r>
-        <w:t xml:space="preserve"> </w:t>
-      </w:r>
-      <w:r>
-        <w:t xml:space="preserve">section from previous session note</w:t>
-      </w:r>
-    </w:p>
-    <w:p>
-      <w:pPr>
-        <w:numPr>
-          <w:ilvl w:val="0"/>
-          <w:numId w:val="1006"/>
-        </w:numPr>
-        <w:pStyle w:val="Compact"/>
-      </w:pPr>
-      <w:r>
-        <w:t xml:space="preserve">Update intangible scores at start or end of session</w:t>
-      </w:r>
-    </w:p>
-    <w:p>
-      <w:pPr>
-        <w:numPr>
-          <w:ilvl w:val="0"/>
-          <w:numId w:val="1006"/>
-        </w:numPr>
-        <w:pStyle w:val="Compact"/>
-      </w:pPr>
-      <w:r>
-        <w:t xml:space="preserve">Take notes during session</w:t>
-      </w:r>
-    </w:p>
-    <w:p>
-      <w:pPr>
-        <w:numPr>
-          <w:ilvl w:val="0"/>
-          <w:numId w:val="1006"/>
-        </w:numPr>
-        <w:pStyle w:val="Compact"/>
-      </w:pPr>
-      <w:r>
-        <w:t xml:space="preserve">At end: choose assignment from selector, draft client summary</w:t>
-      </w:r>
-    </w:p>
-    <w:p>
-      <w:pPr>
-        <w:numPr>
-          <w:ilvl w:val="0"/>
-          <w:numId w:val="1006"/>
         </w:numPr>
         <w:pStyle w:val="Compact"/>
       </w:pPr>
@@ -3784,7 +3855,7 @@
       <w:pPr>
         <w:numPr>
           <w:ilvl w:val="0"/>
-          <w:numId w:val="1007"/>
+          <w:numId w:val="1006"/>
         </w:numPr>
         <w:pStyle w:val="Compact"/>
       </w:pPr>
@@ -3800,6 +3871,40 @@
           <w:b/>
         </w:rPr>
         <w:t xml:space="preserve">~20 active clients</w:t>
+      </w:r>
+    </w:p>
+    <w:p>
+      <w:pPr>
+        <w:numPr>
+          <w:ilvl w:val="0"/>
+          <w:numId w:val="1006"/>
+        </w:numPr>
+        <w:pStyle w:val="Compact"/>
+      </w:pPr>
+      <w:r>
+        <w:t xml:space="preserve">Session frequency: typically bi-weekly (every 2 weeks)</w:t>
+      </w:r>
+    </w:p>
+    <w:p>
+      <w:pPr>
+        <w:numPr>
+          <w:ilvl w:val="0"/>
+          <w:numId w:val="1006"/>
+        </w:numPr>
+        <w:pStyle w:val="Compact"/>
+      </w:pPr>
+      <w:r>
+        <w:t xml:space="preserve">Program duration: 12 lessons over ~6 months</w:t>
+      </w:r>
+    </w:p>
+    <w:bookmarkEnd w:id="52"/>
+    <w:bookmarkStart w:id="53" w:name="privacy-security"/>
+    <w:p>
+      <w:pPr>
+        <w:pStyle w:val="Heading3"/>
+      </w:pPr>
+      <w:r>
+        <w:t xml:space="preserve">Privacy &amp; Security</w:t>
       </w:r>
     </w:p>
     <w:p>
@@ -3811,7 +3916,11 @@
         <w:pStyle w:val="Compact"/>
       </w:pPr>
       <w:r>
-        <w:t xml:space="preserve">Session frequency: typically bi-weekly (every 2 weeks)</w:t>
+        <w:rPr>
+          <w:bCs/>
+          <w:b/>
+        </w:rPr>
+        <w:t xml:space="preserve">All client data is confidential</w:t>
       </w:r>
     </w:p>
     <w:p>
@@ -3823,62 +3932,24 @@
         <w:pStyle w:val="Compact"/>
       </w:pPr>
       <w:r>
-        <w:t xml:space="preserve">Program duration: 12 lessons over ~6 months</w:t>
-      </w:r>
-    </w:p>
-    <w:bookmarkEnd w:id="52"/>
-    <w:bookmarkStart w:id="53" w:name="privacy-security"/>
-    <w:p>
-      <w:pPr>
-        <w:pStyle w:val="Heading3"/>
-      </w:pPr>
-      <w:r>
-        <w:t xml:space="preserve">Privacy &amp; Security</w:t>
+        <w:t xml:space="preserve">GitHub repo should remain</w:t>
+      </w:r>
+      <w:r>
+        <w:t xml:space="preserve"> </w:t>
+      </w:r>
+      <w:r>
+        <w:rPr>
+          <w:bCs/>
+          <w:b/>
+        </w:rPr>
+        <w:t xml:space="preserve">private</w:t>
       </w:r>
     </w:p>
     <w:p>
       <w:pPr>
         <w:numPr>
           <w:ilvl w:val="0"/>
-          <w:numId w:val="1008"/>
-        </w:numPr>
-        <w:pStyle w:val="Compact"/>
-      </w:pPr>
-      <w:r>
-        <w:rPr>
-          <w:bCs/>
-          <w:b/>
-        </w:rPr>
-        <w:t xml:space="preserve">All client data is confidential</w:t>
-      </w:r>
-    </w:p>
-    <w:p>
-      <w:pPr>
-        <w:numPr>
-          <w:ilvl w:val="0"/>
-          <w:numId w:val="1008"/>
-        </w:numPr>
-        <w:pStyle w:val="Compact"/>
-      </w:pPr>
-      <w:r>
-        <w:t xml:space="preserve">GitHub repo should remain</w:t>
-      </w:r>
-      <w:r>
-        <w:t xml:space="preserve"> </w:t>
-      </w:r>
-      <w:r>
-        <w:rPr>
-          <w:bCs/>
-          <w:b/>
-        </w:rPr>
-        <w:t xml:space="preserve">private</w:t>
-      </w:r>
-    </w:p>
-    <w:p>
-      <w:pPr>
-        <w:numPr>
-          <w:ilvl w:val="0"/>
-          <w:numId w:val="1008"/>
+          <w:numId w:val="1007"/>
         </w:numPr>
         <w:pStyle w:val="Compact"/>
       </w:pPr>
@@ -4013,16 +4084,56 @@
       <w:pPr>
         <w:numPr>
           <w:ilvl w:val="0"/>
+          <w:numId w:val="1008"/>
+        </w:numPr>
+        <w:pStyle w:val="Compact"/>
+      </w:pPr>
+      <w:r>
+        <w:rPr>
+          <w:bCs/>
+          <w:b/>
+        </w:rPr>
+        <w:t xml:space="preserve">Template Placeholder System</w:t>
+      </w:r>
+    </w:p>
+    <w:p>
+      <w:pPr>
+        <w:numPr>
+          <w:ilvl w:val="1"/>
           <w:numId w:val="1009"/>
         </w:numPr>
         <w:pStyle w:val="Compact"/>
       </w:pPr>
       <w:r>
-        <w:rPr>
-          <w:bCs/>
-          <w:b/>
-        </w:rPr>
-        <w:t xml:space="preserve">Template Placeholder System</w:t>
+        <w:t xml:space="preserve">Decide: simple manual placeholders vs. full Templater automation</w:t>
+      </w:r>
+    </w:p>
+    <w:p>
+      <w:pPr>
+        <w:numPr>
+          <w:ilvl w:val="1"/>
+          <w:numId w:val="1009"/>
+        </w:numPr>
+        <w:pStyle w:val="Compact"/>
+      </w:pPr>
+      <w:r>
+        <w:t xml:space="preserve">Update all templates accordingly</w:t>
+      </w:r>
+    </w:p>
+    <w:p>
+      <w:pPr>
+        <w:numPr>
+          <w:ilvl w:val="0"/>
+          <w:numId w:val="1008"/>
+        </w:numPr>
+        <w:pStyle w:val="Compact"/>
+      </w:pPr>
+      <w:r>
+        <w:rPr>
+          <w:bCs/>
+          <w:b/>
+        </w:rPr>
+        <w:t xml:space="preserve">Dataview Queries</w:t>
       </w:r>
     </w:p>
     <w:p>
@@ -4034,35 +4145,23 @@
         <w:pStyle w:val="Compact"/>
       </w:pPr>
       <w:r>
-        <w:t xml:space="preserve">Decide: simple manual placeholders vs. full Templater automation</w:t>
-      </w:r>
-    </w:p>
-    <w:p>
-      <w:pPr>
-        <w:numPr>
-          <w:ilvl w:val="1"/>
-          <w:numId w:val="1010"/>
-        </w:numPr>
-        <w:pStyle w:val="Compact"/>
-      </w:pPr>
-      <w:r>
-        <w:t xml:space="preserve">Update all templates accordingly</w:t>
+        <w:t xml:space="preserve">Build queries for: active clients list, recent sessions, low PFS scores, upcoming sessions</w:t>
       </w:r>
     </w:p>
     <w:p>
       <w:pPr>
         <w:numPr>
           <w:ilvl w:val="0"/>
-          <w:numId w:val="1009"/>
-        </w:numPr>
-        <w:pStyle w:val="Compact"/>
-      </w:pPr>
-      <w:r>
-        <w:rPr>
-          <w:bCs/>
-          <w:b/>
-        </w:rPr>
-        <w:t xml:space="preserve">Dataview Queries</w:t>
+          <w:numId w:val="1008"/>
+        </w:numPr>
+        <w:pStyle w:val="Compact"/>
+      </w:pPr>
+      <w:r>
+        <w:rPr>
+          <w:bCs/>
+          <w:b/>
+        </w:rPr>
+        <w:t xml:space="preserve">Additional Forms</w:t>
       </w:r>
     </w:p>
     <w:p>
@@ -4074,23 +4173,23 @@
         <w:pStyle w:val="Compact"/>
       </w:pPr>
       <w:r>
-        <w:t xml:space="preserve">Build queries for: active clients list, recent sessions, low PFS scores, upcoming sessions</w:t>
+        <w:t xml:space="preserve">Convert remaining LMI forms as they come up in lessons 3-12</w:t>
       </w:r>
     </w:p>
     <w:p>
       <w:pPr>
         <w:numPr>
           <w:ilvl w:val="0"/>
-          <w:numId w:val="1009"/>
-        </w:numPr>
-        <w:pStyle w:val="Compact"/>
-      </w:pPr>
-      <w:r>
-        <w:rPr>
-          <w:bCs/>
-          <w:b/>
-        </w:rPr>
-        <w:t xml:space="preserve">Additional Forms</w:t>
+          <w:numId w:val="1008"/>
+        </w:numPr>
+        <w:pStyle w:val="Compact"/>
+      </w:pPr>
+      <w:r>
+        <w:rPr>
+          <w:bCs/>
+          <w:b/>
+        </w:rPr>
+        <w:t xml:space="preserve">Habib BuJawdeh Client</w:t>
       </w:r>
     </w:p>
     <w:p>
@@ -4102,34 +4201,6 @@
         <w:pStyle w:val="Compact"/>
       </w:pPr>
       <w:r>
-        <w:t xml:space="preserve">Convert remaining LMI forms as they come up in lessons 3-12</w:t>
-      </w:r>
-    </w:p>
-    <w:p>
-      <w:pPr>
-        <w:numPr>
-          <w:ilvl w:val="0"/>
-          <w:numId w:val="1009"/>
-        </w:numPr>
-        <w:pStyle w:val="Compact"/>
-      </w:pPr>
-      <w:r>
-        <w:rPr>
-          <w:bCs/>
-          <w:b/>
-        </w:rPr>
-        <w:t xml:space="preserve">Habib BuJawdeh Client</w:t>
-      </w:r>
-    </w:p>
-    <w:p>
-      <w:pPr>
-        <w:numPr>
-          <w:ilvl w:val="1"/>
-          <w:numId w:val="1013"/>
-        </w:numPr>
-        <w:pStyle w:val="Compact"/>
-      </w:pPr>
-      <w:r>
         <w:t xml:space="preserve">Complete OPFMS setup for the newly created client</w:t>
       </w:r>
     </w:p>
@@ -4147,16 +4218,56 @@
       <w:pPr>
         <w:numPr>
           <w:ilvl w:val="0"/>
+          <w:numId w:val="1013"/>
+        </w:numPr>
+        <w:pStyle w:val="Compact"/>
+      </w:pPr>
+      <w:r>
+        <w:rPr>
+          <w:bCs/>
+          <w:b/>
+        </w:rPr>
+        <w:t xml:space="preserve">WhatsApp Link Sharing</w:t>
+      </w:r>
+    </w:p>
+    <w:p>
+      <w:pPr>
+        <w:numPr>
+          <w:ilvl w:val="1"/>
           <w:numId w:val="1014"/>
         </w:numPr>
         <w:pStyle w:val="Compact"/>
       </w:pPr>
       <w:r>
-        <w:rPr>
-          <w:bCs/>
-          <w:b/>
-        </w:rPr>
-        <w:t xml:space="preserve">WhatsApp Link Sharing</w:t>
+        <w:t xml:space="preserve">Generate shareable markdown links for client summaries</w:t>
+      </w:r>
+    </w:p>
+    <w:p>
+      <w:pPr>
+        <w:numPr>
+          <w:ilvl w:val="1"/>
+          <w:numId w:val="1014"/>
+        </w:numPr>
+        <w:pStyle w:val="Compact"/>
+      </w:pPr>
+      <w:r>
+        <w:t xml:space="preserve">Options: Obsidian Publish (paid) or self-hosted static site</w:t>
+      </w:r>
+    </w:p>
+    <w:p>
+      <w:pPr>
+        <w:numPr>
+          <w:ilvl w:val="0"/>
+          <w:numId w:val="1013"/>
+        </w:numPr>
+        <w:pStyle w:val="Compact"/>
+      </w:pPr>
+      <w:r>
+        <w:rPr>
+          <w:bCs/>
+          <w:b/>
+        </w:rPr>
+        <w:t xml:space="preserve">Transcript Integration</w:t>
       </w:r>
     </w:p>
     <w:p>
@@ -4168,7 +4279,7 @@
         <w:pStyle w:val="Compact"/>
       </w:pPr>
       <w:r>
-        <w:t xml:space="preserve">Generate shareable markdown links for client summaries</w:t>
+        <w:t xml:space="preserve">Automate action step extraction from Zoom/Fathom</w:t>
       </w:r>
     </w:p>
     <w:p>
@@ -4180,23 +4291,23 @@
         <w:pStyle w:val="Compact"/>
       </w:pPr>
       <w:r>
-        <w:t xml:space="preserve">Options: Obsidian Publish (paid) or self-hosted static site</w:t>
+        <w:t xml:space="preserve">Webhook or API integration</w:t>
       </w:r>
     </w:p>
     <w:p>
       <w:pPr>
         <w:numPr>
           <w:ilvl w:val="0"/>
-          <w:numId w:val="1014"/>
-        </w:numPr>
-        <w:pStyle w:val="Compact"/>
-      </w:pPr>
-      <w:r>
-        <w:rPr>
-          <w:bCs/>
-          <w:b/>
-        </w:rPr>
-        <w:t xml:space="preserve">Transcript Integration</w:t>
+          <w:numId w:val="1013"/>
+        </w:numPr>
+        <w:pStyle w:val="Compact"/>
+      </w:pPr>
+      <w:r>
+        <w:rPr>
+          <w:bCs/>
+          <w:b/>
+        </w:rPr>
+        <w:t xml:space="preserve">Dashboard View</w:t>
       </w:r>
     </w:p>
     <w:p>
@@ -4208,7 +4319,7 @@
         <w:pStyle w:val="Compact"/>
       </w:pPr>
       <w:r>
-        <w:t xml:space="preserve">Automate action step extraction from Zoom/Fathom</w:t>
+        <w:t xml:space="preserve">Create a vault homepage with Dataview dashboards</w:t>
       </w:r>
     </w:p>
     <w:p>
@@ -4220,46 +4331,6 @@
         <w:pStyle w:val="Compact"/>
       </w:pPr>
       <w:r>
-        <w:t xml:space="preserve">Webhook or API integration</w:t>
-      </w:r>
-    </w:p>
-    <w:p>
-      <w:pPr>
-        <w:numPr>
-          <w:ilvl w:val="0"/>
-          <w:numId w:val="1014"/>
-        </w:numPr>
-        <w:pStyle w:val="Compact"/>
-      </w:pPr>
-      <w:r>
-        <w:rPr>
-          <w:bCs/>
-          <w:b/>
-        </w:rPr>
-        <w:t xml:space="preserve">Dashboard View</w:t>
-      </w:r>
-    </w:p>
-    <w:p>
-      <w:pPr>
-        <w:numPr>
-          <w:ilvl w:val="1"/>
-          <w:numId w:val="1017"/>
-        </w:numPr>
-        <w:pStyle w:val="Compact"/>
-      </w:pPr>
-      <w:r>
-        <w:t xml:space="preserve">Create a vault homepage with Dataview dashboards</w:t>
-      </w:r>
-    </w:p>
-    <w:p>
-      <w:pPr>
-        <w:numPr>
-          <w:ilvl w:val="1"/>
-          <w:numId w:val="1017"/>
-        </w:numPr>
-        <w:pStyle w:val="Compact"/>
-      </w:pPr>
-      <w:r>
         <w:t xml:space="preserve">At-a-glance view of all 20 clients</w:t>
       </w:r>
     </w:p>
@@ -4277,16 +4348,56 @@
       <w:pPr>
         <w:numPr>
           <w:ilvl w:val="0"/>
+          <w:numId w:val="1017"/>
+        </w:numPr>
+        <w:pStyle w:val="Compact"/>
+      </w:pPr>
+      <w:r>
+        <w:rPr>
+          <w:bCs/>
+          <w:b/>
+        </w:rPr>
+        <w:t xml:space="preserve">Automated Session Prep</w:t>
+      </w:r>
+    </w:p>
+    <w:p>
+      <w:pPr>
+        <w:numPr>
+          <w:ilvl w:val="1"/>
           <w:numId w:val="1018"/>
         </w:numPr>
         <w:pStyle w:val="Compact"/>
       </w:pPr>
       <w:r>
-        <w:rPr>
-          <w:bCs/>
-          <w:b/>
-        </w:rPr>
-        <w:t xml:space="preserve">Automated Session Prep</w:t>
+        <w:t xml:space="preserve">AI generates pre-session briefing from previous notes</w:t>
+      </w:r>
+    </w:p>
+    <w:p>
+      <w:pPr>
+        <w:numPr>
+          <w:ilvl w:val="1"/>
+          <w:numId w:val="1018"/>
+        </w:numPr>
+        <w:pStyle w:val="Compact"/>
+      </w:pPr>
+      <w:r>
+        <w:t xml:space="preserve">Auto-populated carry-forward section</w:t>
+      </w:r>
+    </w:p>
+    <w:p>
+      <w:pPr>
+        <w:numPr>
+          <w:ilvl w:val="0"/>
+          <w:numId w:val="1017"/>
+        </w:numPr>
+        <w:pStyle w:val="Compact"/>
+      </w:pPr>
+      <w:r>
+        <w:rPr>
+          <w:bCs/>
+          <w:b/>
+        </w:rPr>
+        <w:t xml:space="preserve">Goal Tracking Automation</w:t>
       </w:r>
     </w:p>
     <w:p>
@@ -4298,7 +4409,7 @@
         <w:pStyle w:val="Compact"/>
       </w:pPr>
       <w:r>
-        <w:t xml:space="preserve">AI generates pre-session briefing from previous notes</w:t>
+        <w:t xml:space="preserve">Cross-note goal status tracking</w:t>
       </w:r>
     </w:p>
     <w:p>
@@ -4310,23 +4421,23 @@
         <w:pStyle w:val="Compact"/>
       </w:pPr>
       <w:r>
-        <w:t xml:space="preserve">Auto-populated carry-forward section</w:t>
+        <w:t xml:space="preserve">Alert when goals are overdue or incomplete</w:t>
       </w:r>
     </w:p>
     <w:p>
       <w:pPr>
         <w:numPr>
           <w:ilvl w:val="0"/>
-          <w:numId w:val="1018"/>
-        </w:numPr>
-        <w:pStyle w:val="Compact"/>
-      </w:pPr>
-      <w:r>
-        <w:rPr>
-          <w:bCs/>
-          <w:b/>
-        </w:rPr>
-        <w:t xml:space="preserve">Goal Tracking Automation</w:t>
+          <w:numId w:val="1017"/>
+        </w:numPr>
+        <w:pStyle w:val="Compact"/>
+      </w:pPr>
+      <w:r>
+        <w:rPr>
+          <w:bCs/>
+          <w:b/>
+        </w:rPr>
+        <w:t xml:space="preserve">Analytics</w:t>
       </w:r>
     </w:p>
     <w:p>
@@ -4338,7 +4449,7 @@
         <w:pStyle w:val="Compact"/>
       </w:pPr>
       <w:r>
-        <w:t xml:space="preserve">Cross-note goal status tracking</w:t>
+        <w:t xml:space="preserve">PFS trends over time</w:t>
       </w:r>
     </w:p>
     <w:p>
@@ -4346,46 +4457,6 @@
         <w:numPr>
           <w:ilvl w:val="1"/>
           <w:numId w:val="1020"/>
-        </w:numPr>
-        <w:pStyle w:val="Compact"/>
-      </w:pPr>
-      <w:r>
-        <w:t xml:space="preserve">Alert when goals are overdue or incomplete</w:t>
-      </w:r>
-    </w:p>
-    <w:p>
-      <w:pPr>
-        <w:numPr>
-          <w:ilvl w:val="0"/>
-          <w:numId w:val="1018"/>
-        </w:numPr>
-        <w:pStyle w:val="Compact"/>
-      </w:pPr>
-      <w:r>
-        <w:rPr>
-          <w:bCs/>
-          <w:b/>
-        </w:rPr>
-        <w:t xml:space="preserve">Analytics</w:t>
-      </w:r>
-    </w:p>
-    <w:p>
-      <w:pPr>
-        <w:numPr>
-          <w:ilvl w:val="1"/>
-          <w:numId w:val="1021"/>
-        </w:numPr>
-        <w:pStyle w:val="Compact"/>
-      </w:pPr>
-      <w:r>
-        <w:t xml:space="preserve">PFS trends over time</w:t>
-      </w:r>
-    </w:p>
-    <w:p>
-      <w:pPr>
-        <w:numPr>
-          <w:ilvl w:val="1"/>
-          <w:numId w:val="1021"/>
         </w:numPr>
         <w:pStyle w:val="Compact"/>
       </w:pPr>
@@ -4847,7 +4918,7 @@
       <w:pPr>
         <w:numPr>
           <w:ilvl w:val="0"/>
-          <w:numId w:val="1022"/>
+          <w:numId w:val="1021"/>
         </w:numPr>
         <w:pStyle w:val="Compact"/>
       </w:pPr>
@@ -4863,6 +4934,54 @@
       </w:r>
       <w:r>
         <w:t xml:space="preserve">UTF-8</w:t>
+      </w:r>
+    </w:p>
+    <w:p>
+      <w:pPr>
+        <w:numPr>
+          <w:ilvl w:val="0"/>
+          <w:numId w:val="1021"/>
+        </w:numPr>
+        <w:pStyle w:val="Compact"/>
+      </w:pPr>
+      <w:r>
+        <w:rPr>
+          <w:bCs/>
+          <w:b/>
+        </w:rPr>
+        <w:t xml:space="preserve">Line endings:</w:t>
+      </w:r>
+      <w:r>
+        <w:t xml:space="preserve"> </w:t>
+      </w:r>
+      <w:r>
+        <w:t xml:space="preserve">LF (Unix-style)</w:t>
+      </w:r>
+    </w:p>
+    <w:p>
+      <w:pPr>
+        <w:numPr>
+          <w:ilvl w:val="0"/>
+          <w:numId w:val="1021"/>
+        </w:numPr>
+        <w:pStyle w:val="Compact"/>
+      </w:pPr>
+      <w:r>
+        <w:rPr>
+          <w:bCs/>
+          <w:b/>
+        </w:rPr>
+        <w:t xml:space="preserve">No BOM</w:t>
+      </w:r>
+    </w:p>
+    <w:bookmarkEnd w:id="62"/>
+    <w:bookmarkStart w:id="63" w:name="backup-strategy"/>
+    <w:p>
+      <w:pPr>
+        <w:pStyle w:val="Heading3"/>
+      </w:pPr>
+      <w:r>
+        <w:t xml:space="preserve">Backup Strategy</w:t>
       </w:r>
     </w:p>
     <w:p>
@@ -4878,13 +4997,13 @@
           <w:bCs/>
           <w:b/>
         </w:rPr>
-        <w:t xml:space="preserve">Line endings:</w:t>
-      </w:r>
-      <w:r>
-        <w:t xml:space="preserve"> </w:t>
-      </w:r>
-      <w:r>
-        <w:t xml:space="preserve">LF (Unix-style)</w:t>
+        <w:t xml:space="preserve">Primary:</w:t>
+      </w:r>
+      <w:r>
+        <w:t xml:space="preserve"> </w:t>
+      </w:r>
+      <w:r>
+        <w:t xml:space="preserve">GitHub repo (version controlled)</w:t>
       </w:r>
     </w:p>
     <w:p>
@@ -4900,68 +5019,20 @@
           <w:bCs/>
           <w:b/>
         </w:rPr>
-        <w:t xml:space="preserve">No BOM</w:t>
-      </w:r>
-    </w:p>
-    <w:bookmarkEnd w:id="62"/>
-    <w:bookmarkStart w:id="63" w:name="backup-strategy"/>
-    <w:p>
-      <w:pPr>
-        <w:pStyle w:val="Heading3"/>
-      </w:pPr>
-      <w:r>
-        <w:t xml:space="preserve">Backup Strategy</w:t>
+        <w:t xml:space="preserve">Secondary:</w:t>
+      </w:r>
+      <w:r>
+        <w:t xml:space="preserve"> </w:t>
+      </w:r>
+      <w:r>
+        <w:t xml:space="preserve">iCloud Drive (where vault lives)</w:t>
       </w:r>
     </w:p>
     <w:p>
       <w:pPr>
         <w:numPr>
           <w:ilvl w:val="0"/>
-          <w:numId w:val="1023"/>
-        </w:numPr>
-        <w:pStyle w:val="Compact"/>
-      </w:pPr>
-      <w:r>
-        <w:rPr>
-          <w:bCs/>
-          <w:b/>
-        </w:rPr>
-        <w:t xml:space="preserve">Primary:</w:t>
-      </w:r>
-      <w:r>
-        <w:t xml:space="preserve"> </w:t>
-      </w:r>
-      <w:r>
-        <w:t xml:space="preserve">GitHub repo (version controlled)</w:t>
-      </w:r>
-    </w:p>
-    <w:p>
-      <w:pPr>
-        <w:numPr>
-          <w:ilvl w:val="0"/>
-          <w:numId w:val="1023"/>
-        </w:numPr>
-        <w:pStyle w:val="Compact"/>
-      </w:pPr>
-      <w:r>
-        <w:rPr>
-          <w:bCs/>
-          <w:b/>
-        </w:rPr>
-        <w:t xml:space="preserve">Secondary:</w:t>
-      </w:r>
-      <w:r>
-        <w:t xml:space="preserve"> </w:t>
-      </w:r>
-      <w:r>
-        <w:t xml:space="preserve">iCloud Drive (where vault lives)</w:t>
-      </w:r>
-    </w:p>
-    <w:p>
-      <w:pPr>
-        <w:numPr>
-          <w:ilvl w:val="0"/>
-          <w:numId w:val="1023"/>
+          <w:numId w:val="1022"/>
         </w:numPr>
         <w:pStyle w:val="Compact"/>
       </w:pPr>
@@ -5201,6 +5272,44 @@
           </w:p>
         </w:tc>
       </w:tr>
+      <w:tr>
+        <w:tc>
+          <w:tcPr/>
+          <w:p>
+            <w:pPr>
+              <w:pStyle w:val="Compact"/>
+              <w:jc w:val="left"/>
+            </w:pPr>
+            <w:r>
+              <w:t xml:space="preserve">2026-09-11</w:t>
+            </w:r>
+          </w:p>
+        </w:tc>
+        <w:tc>
+          <w:tcPr/>
+          <w:p>
+            <w:pPr>
+              <w:pStyle w:val="Compact"/>
+              <w:jc w:val="left"/>
+            </w:pPr>
+            <w:r>
+              <w:t xml:space="preserve">1.4</w:t>
+            </w:r>
+          </w:p>
+        </w:tc>
+        <w:tc>
+          <w:tcPr/>
+          <w:p>
+            <w:pPr>
+              <w:pStyle w:val="Compact"/>
+              <w:jc w:val="left"/>
+            </w:pPr>
+            <w:r>
+              <w:t xml:space="preserve">Added New-Client-Setup.md — one-trigger wizard that creates client folder + Sessions/ + Documents/ + full OPFMS automatically</w:t>
+            </w:r>
+          </w:p>
+        </w:tc>
+      </w:tr>
     </w:tbl>
     <w:p>
       <w:r>
@@ -5231,7 +5340,7 @@
       <w:pPr>
         <w:numPr>
           <w:ilvl w:val="0"/>
-          <w:numId w:val="1024"/>
+          <w:numId w:val="1023"/>
         </w:numPr>
         <w:pStyle w:val="Compact"/>
       </w:pPr>
@@ -5253,7 +5362,7 @@
       <w:pPr>
         <w:numPr>
           <w:ilvl w:val="0"/>
-          <w:numId w:val="1024"/>
+          <w:numId w:val="1023"/>
         </w:numPr>
         <w:pStyle w:val="Compact"/>
       </w:pPr>
@@ -5275,7 +5384,7 @@
       <w:pPr>
         <w:numPr>
           <w:ilvl w:val="0"/>
-          <w:numId w:val="1024"/>
+          <w:numId w:val="1023"/>
         </w:numPr>
         <w:pStyle w:val="Compact"/>
       </w:pPr>
@@ -5297,7 +5406,7 @@
       <w:pPr>
         <w:numPr>
           <w:ilvl w:val="0"/>
-          <w:numId w:val="1024"/>
+          <w:numId w:val="1023"/>
         </w:numPr>
         <w:pStyle w:val="Compact"/>
       </w:pPr>
@@ -5319,7 +5428,7 @@
       <w:pPr>
         <w:numPr>
           <w:ilvl w:val="0"/>
-          <w:numId w:val="1024"/>
+          <w:numId w:val="1023"/>
         </w:numPr>
         <w:pStyle w:val="Compact"/>
       </w:pPr>
@@ -5341,7 +5450,7 @@
       <w:pPr>
         <w:numPr>
           <w:ilvl w:val="0"/>
-          <w:numId w:val="1024"/>
+          <w:numId w:val="1023"/>
         </w:numPr>
         <w:pStyle w:val="Compact"/>
       </w:pPr>
@@ -5363,7 +5472,7 @@
       <w:pPr>
         <w:numPr>
           <w:ilvl w:val="0"/>
-          <w:numId w:val="1024"/>
+          <w:numId w:val="1023"/>
         </w:numPr>
         <w:pStyle w:val="Compact"/>
       </w:pPr>
@@ -5385,7 +5494,7 @@
       <w:pPr>
         <w:numPr>
           <w:ilvl w:val="0"/>
-          <w:numId w:val="1024"/>
+          <w:numId w:val="1023"/>
         </w:numPr>
         <w:pStyle w:val="Compact"/>
       </w:pPr>
@@ -5831,6 +5940,12 @@
     </w:lvlOverride>
   </w:num>
   <w:num w:numId="1006">
+    <w:abstractNumId w:val="991"/>
+  </w:num>
+  <w:num w:numId="1007">
+    <w:abstractNumId w:val="991"/>
+  </w:num>
+  <w:num w:numId="1008">
     <w:abstractNumId w:val="99411"/>
     <w:lvlOverride w:ilvl="0">
       <w:startOverride w:val="1"/>
@@ -5860,13 +5975,19 @@
       <w:startOverride w:val="1"/>
     </w:lvlOverride>
   </w:num>
-  <w:num w:numId="1007">
+  <w:num w:numId="1009">
     <w:abstractNumId w:val="991"/>
   </w:num>
-  <w:num w:numId="1008">
+  <w:num w:numId="1010">
     <w:abstractNumId w:val="991"/>
   </w:num>
-  <w:num w:numId="1009">
+  <w:num w:numId="1011">
+    <w:abstractNumId w:val="991"/>
+  </w:num>
+  <w:num w:numId="1012">
+    <w:abstractNumId w:val="991"/>
+  </w:num>
+  <w:num w:numId="1013">
     <w:abstractNumId w:val="99411"/>
     <w:lvlOverride w:ilvl="0">
       <w:startOverride w:val="1"/>
@@ -5896,19 +6017,16 @@
       <w:startOverride w:val="1"/>
     </w:lvlOverride>
   </w:num>
-  <w:num w:numId="1010">
+  <w:num w:numId="1014">
     <w:abstractNumId w:val="991"/>
   </w:num>
-  <w:num w:numId="1011">
+  <w:num w:numId="1015">
     <w:abstractNumId w:val="991"/>
   </w:num>
-  <w:num w:numId="1012">
+  <w:num w:numId="1016">
     <w:abstractNumId w:val="991"/>
   </w:num>
-  <w:num w:numId="1013">
-    <w:abstractNumId w:val="991"/>
-  </w:num>
-  <w:num w:numId="1014">
+  <w:num w:numId="1017">
     <w:abstractNumId w:val="99411"/>
     <w:lvlOverride w:ilvl="0">
       <w:startOverride w:val="1"/>
@@ -5938,44 +6056,8 @@
       <w:startOverride w:val="1"/>
     </w:lvlOverride>
   </w:num>
-  <w:num w:numId="1015">
+  <w:num w:numId="1018">
     <w:abstractNumId w:val="991"/>
-  </w:num>
-  <w:num w:numId="1016">
-    <w:abstractNumId w:val="991"/>
-  </w:num>
-  <w:num w:numId="1017">
-    <w:abstractNumId w:val="991"/>
-  </w:num>
-  <w:num w:numId="1018">
-    <w:abstractNumId w:val="99411"/>
-    <w:lvlOverride w:ilvl="0">
-      <w:startOverride w:val="1"/>
-    </w:lvlOverride>
-    <w:lvlOverride w:ilvl="1">
-      <w:startOverride w:val="1"/>
-    </w:lvlOverride>
-    <w:lvlOverride w:ilvl="2">
-      <w:startOverride w:val="1"/>
-    </w:lvlOverride>
-    <w:lvlOverride w:ilvl="3">
-      <w:startOverride w:val="1"/>
-    </w:lvlOverride>
-    <w:lvlOverride w:ilvl="4">
-      <w:startOverride w:val="1"/>
-    </w:lvlOverride>
-    <w:lvlOverride w:ilvl="5">
-      <w:startOverride w:val="1"/>
-    </w:lvlOverride>
-    <w:lvlOverride w:ilvl="6">
-      <w:startOverride w:val="1"/>
-    </w:lvlOverride>
-    <w:lvlOverride w:ilvl="7">
-      <w:startOverride w:val="1"/>
-    </w:lvlOverride>
-    <w:lvlOverride w:ilvl="8">
-      <w:startOverride w:val="1"/>
-    </w:lvlOverride>
   </w:num>
   <w:num w:numId="1019">
     <w:abstractNumId w:val="991"/>
@@ -5990,9 +6072,6 @@
     <w:abstractNumId w:val="991"/>
   </w:num>
   <w:num w:numId="1023">
-    <w:abstractNumId w:val="991"/>
-  </w:num>
-  <w:num w:numId="1024">
     <w:abstractNumId w:val="99411"/>
     <w:lvlOverride w:ilvl="0">
       <w:startOverride w:val="1"/>

</xml_diff>

<commit_message>
v1.5: Add [[#heading]] TOC to all 13 vault files + restore corrupted Session-Note.md
</commit_message>
<xml_diff>
--- a/05-Agents/Abacus-AI.docx
+++ b/05-Agents/Abacus-AI.docx
@@ -5306,6 +5306,44 @@
             </w:pPr>
             <w:r>
               <w:t xml:space="preserve">Added New-Client-Setup.md — one-trigger wizard that creates client folder + Sessions/ + Documents/ + full OPFMS automatically</w:t>
+            </w:r>
+          </w:p>
+        </w:tc>
+      </w:tr>
+      <w:tr>
+        <w:tc>
+          <w:tcPr/>
+          <w:p>
+            <w:pPr>
+              <w:pStyle w:val="Compact"/>
+              <w:jc w:val="left"/>
+            </w:pPr>
+            <w:r>
+              <w:t xml:space="preserve">2026-09-11</w:t>
+            </w:r>
+          </w:p>
+        </w:tc>
+        <w:tc>
+          <w:tcPr/>
+          <w:p>
+            <w:pPr>
+              <w:pStyle w:val="Compact"/>
+              <w:jc w:val="left"/>
+            </w:pPr>
+            <w:r>
+              <w:t xml:space="preserve">1.5</w:t>
+            </w:r>
+          </w:p>
+        </w:tc>
+        <w:tc>
+          <w:tcPr/>
+          <w:p>
+            <w:pPr>
+              <w:pStyle w:val="Compact"/>
+              <w:jc w:val="left"/>
+            </w:pPr>
+            <w:r>
+              <w:t xml:space="preserve">Added [[#heading]] TOC navigation to all 13 vault files. Fixed corrupted Session-Note.md (restored from git). All internal links now work in both Live Preview and Reading View.</w:t>
             </w:r>
           </w:p>
         </w:tc>

</xml_diff>